<commit_message>
Done some new task!
</commit_message>
<xml_diff>
--- a/LAB9/COAL Lab 9.docx
+++ b/LAB9/COAL Lab 9.docx
@@ -1,6 +1,6 @@
 
 <file path=word/document.xml><?xml version="1.0" encoding="utf-8"?>
-<w:document xmlns:wpc="http://schemas.microsoft.com/office/word/2010/wordprocessingCanvas" xmlns:cx="http://schemas.microsoft.com/office/drawing/2014/chartex" xmlns:cx1="http://schemas.microsoft.com/office/drawing/2015/9/8/chartex" xmlns:cx2="http://schemas.microsoft.com/office/drawing/2015/10/21/chartex" xmlns:cx3="http://schemas.microsoft.com/office/drawing/2016/5/9/chartex" xmlns:cx4="http://schemas.microsoft.com/office/drawing/2016/5/10/chartex" xmlns:cx5="http://schemas.microsoft.com/office/drawing/2016/5/11/chartex" xmlns:cx6="http://schemas.microsoft.com/office/drawing/2016/5/12/chartex" xmlns:cx7="http://schemas.microsoft.com/office/drawing/2016/5/13/chartex" xmlns:cx8="http://schemas.microsoft.com/office/drawing/2016/5/14/chartex" xmlns:mc="http://schemas.openxmlformats.org/markup-compatibility/2006" xmlns:aink="http://schemas.microsoft.com/office/drawing/2016/ink" xmlns:am3d="http://schemas.microsoft.com/office/drawing/2017/model3d" xmlns:o="urn:schemas-microsoft-com:office:office" xmlns:r="http://schemas.openxmlformats.org/officeDocument/2006/relationships" xmlns:m="http://schemas.openxmlformats.org/officeDocument/2006/math" xmlns:v="urn:schemas-microsoft-com:vml" xmlns:wp14="http://schemas.microsoft.com/office/word/2010/wordprocessingDrawing" xmlns:wp="http://schemas.openxmlformats.org/drawingml/2006/wordprocessingDrawing" xmlns:w10="urn:schemas-microsoft-com:office:word" xmlns:w="http://schemas.openxmlformats.org/wordprocessingml/2006/main" xmlns:w14="http://schemas.microsoft.com/office/word/2010/wordml" xmlns:w15="http://schemas.microsoft.com/office/word/2012/wordml" xmlns:w16cex="http://schemas.microsoft.com/office/word/2018/wordml/cex" xmlns:w16cid="http://schemas.microsoft.com/office/word/2016/wordml/cid" xmlns:w16="http://schemas.microsoft.com/office/word/2018/wordml" xmlns:w16sdtdh="http://schemas.microsoft.com/office/word/2020/wordml/sdtdatahash" xmlns:w16se="http://schemas.microsoft.com/office/word/2015/wordml/symex" xmlns:wpg="http://schemas.microsoft.com/office/word/2010/wordprocessingGroup" xmlns:wpi="http://schemas.microsoft.com/office/word/2010/wordprocessingInk" xmlns:wne="http://schemas.microsoft.com/office/word/2006/wordml" xmlns:wps="http://schemas.microsoft.com/office/word/2010/wordprocessingShape" mc:Ignorable="w14 w15 w16se w16cid w16 w16cex w16sdtdh wp14">
+<w:document xmlns:wpc="http://schemas.microsoft.com/office/word/2010/wordprocessingCanvas" xmlns:cx="http://schemas.microsoft.com/office/drawing/2014/chartex" xmlns:cx1="http://schemas.microsoft.com/office/drawing/2015/9/8/chartex" xmlns:cx2="http://schemas.microsoft.com/office/drawing/2015/10/21/chartex" xmlns:cx3="http://schemas.microsoft.com/office/drawing/2016/5/9/chartex" xmlns:cx4="http://schemas.microsoft.com/office/drawing/2016/5/10/chartex" xmlns:cx5="http://schemas.microsoft.com/office/drawing/2016/5/11/chartex" xmlns:cx6="http://schemas.microsoft.com/office/drawing/2016/5/12/chartex" xmlns:cx7="http://schemas.microsoft.com/office/drawing/2016/5/13/chartex" xmlns:cx8="http://schemas.microsoft.com/office/drawing/2016/5/14/chartex" xmlns:mc="http://schemas.openxmlformats.org/markup-compatibility/2006" xmlns:aink="http://schemas.microsoft.com/office/drawing/2016/ink" xmlns:am3d="http://schemas.microsoft.com/office/drawing/2017/model3d" xmlns:o="urn:schemas-microsoft-com:office:office" xmlns:oel="http://schemas.microsoft.com/office/2019/extlst" xmlns:r="http://schemas.openxmlformats.org/officeDocument/2006/relationships" xmlns:m="http://schemas.openxmlformats.org/officeDocument/2006/math" xmlns:v="urn:schemas-microsoft-com:vml" xmlns:wp14="http://schemas.microsoft.com/office/word/2010/wordprocessingDrawing" xmlns:wp="http://schemas.openxmlformats.org/drawingml/2006/wordprocessingDrawing" xmlns:w10="urn:schemas-microsoft-com:office:word" xmlns:w="http://schemas.openxmlformats.org/wordprocessingml/2006/main" xmlns:w14="http://schemas.microsoft.com/office/word/2010/wordml" xmlns:w15="http://schemas.microsoft.com/office/word/2012/wordml" xmlns:w16cex="http://schemas.microsoft.com/office/word/2018/wordml/cex" xmlns:w16cid="http://schemas.microsoft.com/office/word/2016/wordml/cid" xmlns:w16="http://schemas.microsoft.com/office/word/2018/wordml" xmlns:w16du="http://schemas.microsoft.com/office/word/2023/wordml/word16du" xmlns:w16sdtdh="http://schemas.microsoft.com/office/word/2020/wordml/sdtdatahash" xmlns:w16sdtfl="http://schemas.microsoft.com/office/word/2024/wordml/sdtformatlock" xmlns:w16se="http://schemas.microsoft.com/office/word/2015/wordml/symex" xmlns:wpg="http://schemas.microsoft.com/office/word/2010/wordprocessingGroup" xmlns:wpi="http://schemas.microsoft.com/office/word/2010/wordprocessingInk" xmlns:wne="http://schemas.microsoft.com/office/word/2006/wordml" xmlns:wps="http://schemas.microsoft.com/office/word/2010/wordprocessingShape" mc:Ignorable="w14 w15 w16se w16cid w16 w16cex w16sdtdh w16sdtfl w16du wp14">
   <w:body>
     <w:p>
       <w:pPr>
@@ -1748,6 +1748,30 @@
           <w:bCs/>
         </w:rPr>
       </w:pPr>
+      <w:r>
+        <w:rPr>
+          <w:bCs/>
+        </w:rPr>
+        <w:t>EXAMPLE QUESTION:</w:t>
+      </w:r>
+    </w:p>
+    <w:p>
+      <w:pPr>
+        <w:pStyle w:val="BodyText"/>
+        <w:spacing w:before="209"/>
+        <w:rPr>
+          <w:bCs/>
+        </w:rPr>
+      </w:pPr>
+    </w:p>
+    <w:p>
+      <w:pPr>
+        <w:pStyle w:val="BodyText"/>
+        <w:spacing w:before="209"/>
+        <w:rPr>
+          <w:bCs/>
+        </w:rPr>
+      </w:pPr>
     </w:p>
     <w:p>
       <w:pPr>
@@ -1905,6 +1929,7 @@
         <w:rPr>
           <w:bCs/>
         </w:rPr>
+        <w:lastRenderedPageBreak/>
         <w:t xml:space="preserve">Perform </w:t>
       </w:r>
       <w:r>
@@ -2179,16 +2204,8 @@
         <w:rPr>
           <w:bCs/>
         </w:rPr>
-        <w:t xml:space="preserve">What did you observe </w:t>
-      </w:r>
-      <w:proofErr w:type="gramStart"/>
-      <w:r>
-        <w:rPr>
-          <w:bCs/>
-        </w:rPr>
-        <w:t>when:</w:t>
-      </w:r>
-      <w:proofErr w:type="gramEnd"/>
+        <w:t>What did you observe when:</w:t>
+      </w:r>
     </w:p>
     <w:p>
       <w:pPr>
@@ -2286,21 +2303,7 @@
         <w:rPr>
           <w:bCs/>
         </w:rPr>
-        <w:t xml:space="preserve">0x1234ABCD is </w:t>
-      </w:r>
-      <w:proofErr w:type="spellStart"/>
-      <w:r>
-        <w:rPr>
-          <w:bCs/>
-        </w:rPr>
-        <w:t>ORed</w:t>
-      </w:r>
-      <w:proofErr w:type="spellEnd"/>
-      <w:r>
-        <w:rPr>
-          <w:bCs/>
-        </w:rPr>
-        <w:t xml:space="preserve"> with 0x0000FFFF?</w:t>
+        <w:t>0x1234ABCD is ORed with 0x0000FFFF?</w:t>
       </w:r>
     </w:p>
     <w:p>
@@ -2562,6 +2565,7 @@
         <w:rPr>
           <w:bCs/>
         </w:rPr>
+        <w:lastRenderedPageBreak/>
         <w:t xml:space="preserve">Perform division for the </w:t>
       </w:r>
       <w:r>
@@ -2595,7 +2599,6 @@
         <w:rPr>
           <w:bCs/>
         </w:rPr>
-        <w:lastRenderedPageBreak/>
         <w:t>26</w:t>
       </w:r>
       <m:oMath>
@@ -2939,17 +2942,8 @@
           <w:bCs/>
           <w:szCs w:val="22"/>
         </w:rPr>
-        <w:t xml:space="preserve">What changes in the result did you </w:t>
-      </w:r>
-      <w:proofErr w:type="gramStart"/>
-      <w:r>
-        <w:rPr>
-          <w:bCs/>
-          <w:szCs w:val="22"/>
-        </w:rPr>
-        <w:t>observe:</w:t>
-      </w:r>
-      <w:proofErr w:type="gramEnd"/>
+        <w:t>What changes in the result did you observe:</w:t>
+      </w:r>
     </w:p>
     <w:p>
       <w:pPr>
@@ -3524,7 +3518,15 @@
           <w:bCs/>
           <w:szCs w:val="22"/>
         </w:rPr>
-        <w:t xml:space="preserve">branch name (unconditionally) mentioned immediately after it. </w:t>
+        <w:t xml:space="preserve">branch name </w:t>
+      </w:r>
+      <w:r>
+        <w:rPr>
+          <w:bCs/>
+          <w:szCs w:val="22"/>
+        </w:rPr>
+        <w:lastRenderedPageBreak/>
+        <w:t xml:space="preserve">(unconditionally) mentioned immediately after it. </w:t>
       </w:r>
     </w:p>
     <w:p>
@@ -4538,6 +4540,7 @@
           <w:bCs/>
           <w:color w:val="4F81BD" w:themeColor="accent1"/>
         </w:rPr>
+        <w:lastRenderedPageBreak/>
         <w:t xml:space="preserve">while: </w:t>
       </w:r>
       <w:proofErr w:type="spellStart"/>
@@ -4619,7 +4622,6 @@
           <w:bCs/>
           <w:color w:val="4F81BD" w:themeColor="accent1"/>
         </w:rPr>
-        <w:lastRenderedPageBreak/>
         <w:t>addi</w:t>
       </w:r>
       <w:proofErr w:type="spellEnd"/>
@@ -5696,7 +5698,7 @@
 </file>
 
 <file path=word/endnotes.xml><?xml version="1.0" encoding="utf-8"?>
-<w:endnotes xmlns:wpc="http://schemas.microsoft.com/office/word/2010/wordprocessingCanvas" xmlns:cx="http://schemas.microsoft.com/office/drawing/2014/chartex" xmlns:cx1="http://schemas.microsoft.com/office/drawing/2015/9/8/chartex" xmlns:cx2="http://schemas.microsoft.com/office/drawing/2015/10/21/chartex" xmlns:cx3="http://schemas.microsoft.com/office/drawing/2016/5/9/chartex" xmlns:cx4="http://schemas.microsoft.com/office/drawing/2016/5/10/chartex" xmlns:cx5="http://schemas.microsoft.com/office/drawing/2016/5/11/chartex" xmlns:cx6="http://schemas.microsoft.com/office/drawing/2016/5/12/chartex" xmlns:cx7="http://schemas.microsoft.com/office/drawing/2016/5/13/chartex" xmlns:cx8="http://schemas.microsoft.com/office/drawing/2016/5/14/chartex" xmlns:mc="http://schemas.openxmlformats.org/markup-compatibility/2006" xmlns:aink="http://schemas.microsoft.com/office/drawing/2016/ink" xmlns:am3d="http://schemas.microsoft.com/office/drawing/2017/model3d" xmlns:o="urn:schemas-microsoft-com:office:office" xmlns:r="http://schemas.openxmlformats.org/officeDocument/2006/relationships" xmlns:m="http://schemas.openxmlformats.org/officeDocument/2006/math" xmlns:v="urn:schemas-microsoft-com:vml" xmlns:wp14="http://schemas.microsoft.com/office/word/2010/wordprocessingDrawing" xmlns:wp="http://schemas.openxmlformats.org/drawingml/2006/wordprocessingDrawing" xmlns:w10="urn:schemas-microsoft-com:office:word" xmlns:w="http://schemas.openxmlformats.org/wordprocessingml/2006/main" xmlns:w14="http://schemas.microsoft.com/office/word/2010/wordml" xmlns:w15="http://schemas.microsoft.com/office/word/2012/wordml" xmlns:w16cex="http://schemas.microsoft.com/office/word/2018/wordml/cex" xmlns:w16cid="http://schemas.microsoft.com/office/word/2016/wordml/cid" xmlns:w16="http://schemas.microsoft.com/office/word/2018/wordml" xmlns:w16sdtdh="http://schemas.microsoft.com/office/word/2020/wordml/sdtdatahash" xmlns:w16se="http://schemas.microsoft.com/office/word/2015/wordml/symex" xmlns:wpg="http://schemas.microsoft.com/office/word/2010/wordprocessingGroup" xmlns:wpi="http://schemas.microsoft.com/office/word/2010/wordprocessingInk" xmlns:wne="http://schemas.microsoft.com/office/word/2006/wordml" xmlns:wps="http://schemas.microsoft.com/office/word/2010/wordprocessingShape" mc:Ignorable="w14 w15 w16se w16cid w16 w16cex w16sdtdh wp14">
+<w:endnotes xmlns:wpc="http://schemas.microsoft.com/office/word/2010/wordprocessingCanvas" xmlns:cx="http://schemas.microsoft.com/office/drawing/2014/chartex" xmlns:cx1="http://schemas.microsoft.com/office/drawing/2015/9/8/chartex" xmlns:cx2="http://schemas.microsoft.com/office/drawing/2015/10/21/chartex" xmlns:cx3="http://schemas.microsoft.com/office/drawing/2016/5/9/chartex" xmlns:cx4="http://schemas.microsoft.com/office/drawing/2016/5/10/chartex" xmlns:cx5="http://schemas.microsoft.com/office/drawing/2016/5/11/chartex" xmlns:cx6="http://schemas.microsoft.com/office/drawing/2016/5/12/chartex" xmlns:cx7="http://schemas.microsoft.com/office/drawing/2016/5/13/chartex" xmlns:cx8="http://schemas.microsoft.com/office/drawing/2016/5/14/chartex" xmlns:mc="http://schemas.openxmlformats.org/markup-compatibility/2006" xmlns:aink="http://schemas.microsoft.com/office/drawing/2016/ink" xmlns:am3d="http://schemas.microsoft.com/office/drawing/2017/model3d" xmlns:o="urn:schemas-microsoft-com:office:office" xmlns:oel="http://schemas.microsoft.com/office/2019/extlst" xmlns:r="http://schemas.openxmlformats.org/officeDocument/2006/relationships" xmlns:m="http://schemas.openxmlformats.org/officeDocument/2006/math" xmlns:v="urn:schemas-microsoft-com:vml" xmlns:wp14="http://schemas.microsoft.com/office/word/2010/wordprocessingDrawing" xmlns:wp="http://schemas.openxmlformats.org/drawingml/2006/wordprocessingDrawing" xmlns:w10="urn:schemas-microsoft-com:office:word" xmlns:w="http://schemas.openxmlformats.org/wordprocessingml/2006/main" xmlns:w14="http://schemas.microsoft.com/office/word/2010/wordml" xmlns:w15="http://schemas.microsoft.com/office/word/2012/wordml" xmlns:w16cex="http://schemas.microsoft.com/office/word/2018/wordml/cex" xmlns:w16cid="http://schemas.microsoft.com/office/word/2016/wordml/cid" xmlns:w16="http://schemas.microsoft.com/office/word/2018/wordml" xmlns:w16du="http://schemas.microsoft.com/office/word/2023/wordml/word16du" xmlns:w16sdtdh="http://schemas.microsoft.com/office/word/2020/wordml/sdtdatahash" xmlns:w16sdtfl="http://schemas.microsoft.com/office/word/2024/wordml/sdtformatlock" xmlns:w16se="http://schemas.microsoft.com/office/word/2015/wordml/symex" xmlns:wpg="http://schemas.microsoft.com/office/word/2010/wordprocessingGroup" xmlns:wpi="http://schemas.microsoft.com/office/word/2010/wordprocessingInk" xmlns:wne="http://schemas.microsoft.com/office/word/2006/wordml" xmlns:wps="http://schemas.microsoft.com/office/word/2010/wordprocessingShape" mc:Ignorable="w14 w15 w16se w16cid w16 w16cex w16sdtdh w16sdtfl w16du wp14">
   <w:endnote w:type="separator" w:id="-1">
     <w:p>
       <w:r>
@@ -5715,7 +5717,7 @@
 </file>
 
 <file path=word/footer1.xml><?xml version="1.0" encoding="utf-8"?>
-<w:ftr xmlns:wpc="http://schemas.microsoft.com/office/word/2010/wordprocessingCanvas" xmlns:cx="http://schemas.microsoft.com/office/drawing/2014/chartex" xmlns:cx1="http://schemas.microsoft.com/office/drawing/2015/9/8/chartex" xmlns:cx2="http://schemas.microsoft.com/office/drawing/2015/10/21/chartex" xmlns:cx3="http://schemas.microsoft.com/office/drawing/2016/5/9/chartex" xmlns:cx4="http://schemas.microsoft.com/office/drawing/2016/5/10/chartex" xmlns:cx5="http://schemas.microsoft.com/office/drawing/2016/5/11/chartex" xmlns:cx6="http://schemas.microsoft.com/office/drawing/2016/5/12/chartex" xmlns:cx7="http://schemas.microsoft.com/office/drawing/2016/5/13/chartex" xmlns:cx8="http://schemas.microsoft.com/office/drawing/2016/5/14/chartex" xmlns:mc="http://schemas.openxmlformats.org/markup-compatibility/2006" xmlns:aink="http://schemas.microsoft.com/office/drawing/2016/ink" xmlns:am3d="http://schemas.microsoft.com/office/drawing/2017/model3d" xmlns:o="urn:schemas-microsoft-com:office:office" xmlns:r="http://schemas.openxmlformats.org/officeDocument/2006/relationships" xmlns:m="http://schemas.openxmlformats.org/officeDocument/2006/math" xmlns:v="urn:schemas-microsoft-com:vml" xmlns:wp14="http://schemas.microsoft.com/office/word/2010/wordprocessingDrawing" xmlns:wp="http://schemas.openxmlformats.org/drawingml/2006/wordprocessingDrawing" xmlns:w10="urn:schemas-microsoft-com:office:word" xmlns:w="http://schemas.openxmlformats.org/wordprocessingml/2006/main" xmlns:w14="http://schemas.microsoft.com/office/word/2010/wordml" xmlns:w15="http://schemas.microsoft.com/office/word/2012/wordml" xmlns:w16cex="http://schemas.microsoft.com/office/word/2018/wordml/cex" xmlns:w16cid="http://schemas.microsoft.com/office/word/2016/wordml/cid" xmlns:w16="http://schemas.microsoft.com/office/word/2018/wordml" xmlns:w16sdtdh="http://schemas.microsoft.com/office/word/2020/wordml/sdtdatahash" xmlns:w16se="http://schemas.microsoft.com/office/word/2015/wordml/symex" xmlns:wpg="http://schemas.microsoft.com/office/word/2010/wordprocessingGroup" xmlns:wpi="http://schemas.microsoft.com/office/word/2010/wordprocessingInk" xmlns:wne="http://schemas.microsoft.com/office/word/2006/wordml" xmlns:wps="http://schemas.microsoft.com/office/word/2010/wordprocessingShape" mc:Ignorable="w14 w15 w16se w16cid w16 w16cex w16sdtdh wp14">
+<w:ftr xmlns:wpc="http://schemas.microsoft.com/office/word/2010/wordprocessingCanvas" xmlns:cx="http://schemas.microsoft.com/office/drawing/2014/chartex" xmlns:cx1="http://schemas.microsoft.com/office/drawing/2015/9/8/chartex" xmlns:cx2="http://schemas.microsoft.com/office/drawing/2015/10/21/chartex" xmlns:cx3="http://schemas.microsoft.com/office/drawing/2016/5/9/chartex" xmlns:cx4="http://schemas.microsoft.com/office/drawing/2016/5/10/chartex" xmlns:cx5="http://schemas.microsoft.com/office/drawing/2016/5/11/chartex" xmlns:cx6="http://schemas.microsoft.com/office/drawing/2016/5/12/chartex" xmlns:cx7="http://schemas.microsoft.com/office/drawing/2016/5/13/chartex" xmlns:cx8="http://schemas.microsoft.com/office/drawing/2016/5/14/chartex" xmlns:mc="http://schemas.openxmlformats.org/markup-compatibility/2006" xmlns:aink="http://schemas.microsoft.com/office/drawing/2016/ink" xmlns:am3d="http://schemas.microsoft.com/office/drawing/2017/model3d" xmlns:o="urn:schemas-microsoft-com:office:office" xmlns:oel="http://schemas.microsoft.com/office/2019/extlst" xmlns:r="http://schemas.openxmlformats.org/officeDocument/2006/relationships" xmlns:m="http://schemas.openxmlformats.org/officeDocument/2006/math" xmlns:v="urn:schemas-microsoft-com:vml" xmlns:wp14="http://schemas.microsoft.com/office/word/2010/wordprocessingDrawing" xmlns:wp="http://schemas.openxmlformats.org/drawingml/2006/wordprocessingDrawing" xmlns:w10="urn:schemas-microsoft-com:office:word" xmlns:w="http://schemas.openxmlformats.org/wordprocessingml/2006/main" xmlns:w14="http://schemas.microsoft.com/office/word/2010/wordml" xmlns:w15="http://schemas.microsoft.com/office/word/2012/wordml" xmlns:w16cex="http://schemas.microsoft.com/office/word/2018/wordml/cex" xmlns:w16cid="http://schemas.microsoft.com/office/word/2016/wordml/cid" xmlns:w16="http://schemas.microsoft.com/office/word/2018/wordml" xmlns:w16du="http://schemas.microsoft.com/office/word/2023/wordml/word16du" xmlns:w16sdtdh="http://schemas.microsoft.com/office/word/2020/wordml/sdtdatahash" xmlns:w16sdtfl="http://schemas.microsoft.com/office/word/2024/wordml/sdtformatlock" xmlns:w16se="http://schemas.microsoft.com/office/word/2015/wordml/symex" xmlns:wpg="http://schemas.microsoft.com/office/word/2010/wordprocessingGroup" xmlns:wpi="http://schemas.microsoft.com/office/word/2010/wordprocessingInk" xmlns:wne="http://schemas.microsoft.com/office/word/2006/wordml" xmlns:wps="http://schemas.microsoft.com/office/word/2010/wordprocessingShape" mc:Ignorable="w14 w15 w16se w16cid w16 w16cex w16sdtdh w16sdtfl w16du wp14">
   <w:p>
     <w:pPr>
       <w:pStyle w:val="BodyText"/>
@@ -6282,7 +6284,7 @@
 </file>
 
 <file path=word/footnotes.xml><?xml version="1.0" encoding="utf-8"?>
-<w:footnotes xmlns:wpc="http://schemas.microsoft.com/office/word/2010/wordprocessingCanvas" xmlns:cx="http://schemas.microsoft.com/office/drawing/2014/chartex" xmlns:cx1="http://schemas.microsoft.com/office/drawing/2015/9/8/chartex" xmlns:cx2="http://schemas.microsoft.com/office/drawing/2015/10/21/chartex" xmlns:cx3="http://schemas.microsoft.com/office/drawing/2016/5/9/chartex" xmlns:cx4="http://schemas.microsoft.com/office/drawing/2016/5/10/chartex" xmlns:cx5="http://schemas.microsoft.com/office/drawing/2016/5/11/chartex" xmlns:cx6="http://schemas.microsoft.com/office/drawing/2016/5/12/chartex" xmlns:cx7="http://schemas.microsoft.com/office/drawing/2016/5/13/chartex" xmlns:cx8="http://schemas.microsoft.com/office/drawing/2016/5/14/chartex" xmlns:mc="http://schemas.openxmlformats.org/markup-compatibility/2006" xmlns:aink="http://schemas.microsoft.com/office/drawing/2016/ink" xmlns:am3d="http://schemas.microsoft.com/office/drawing/2017/model3d" xmlns:o="urn:schemas-microsoft-com:office:office" xmlns:r="http://schemas.openxmlformats.org/officeDocument/2006/relationships" xmlns:m="http://schemas.openxmlformats.org/officeDocument/2006/math" xmlns:v="urn:schemas-microsoft-com:vml" xmlns:wp14="http://schemas.microsoft.com/office/word/2010/wordprocessingDrawing" xmlns:wp="http://schemas.openxmlformats.org/drawingml/2006/wordprocessingDrawing" xmlns:w10="urn:schemas-microsoft-com:office:word" xmlns:w="http://schemas.openxmlformats.org/wordprocessingml/2006/main" xmlns:w14="http://schemas.microsoft.com/office/word/2010/wordml" xmlns:w15="http://schemas.microsoft.com/office/word/2012/wordml" xmlns:w16cex="http://schemas.microsoft.com/office/word/2018/wordml/cex" xmlns:w16cid="http://schemas.microsoft.com/office/word/2016/wordml/cid" xmlns:w16="http://schemas.microsoft.com/office/word/2018/wordml" xmlns:w16sdtdh="http://schemas.microsoft.com/office/word/2020/wordml/sdtdatahash" xmlns:w16se="http://schemas.microsoft.com/office/word/2015/wordml/symex" xmlns:wpg="http://schemas.microsoft.com/office/word/2010/wordprocessingGroup" xmlns:wpi="http://schemas.microsoft.com/office/word/2010/wordprocessingInk" xmlns:wne="http://schemas.microsoft.com/office/word/2006/wordml" xmlns:wps="http://schemas.microsoft.com/office/word/2010/wordprocessingShape" mc:Ignorable="w14 w15 w16se w16cid w16 w16cex w16sdtdh wp14">
+<w:footnotes xmlns:wpc="http://schemas.microsoft.com/office/word/2010/wordprocessingCanvas" xmlns:cx="http://schemas.microsoft.com/office/drawing/2014/chartex" xmlns:cx1="http://schemas.microsoft.com/office/drawing/2015/9/8/chartex" xmlns:cx2="http://schemas.microsoft.com/office/drawing/2015/10/21/chartex" xmlns:cx3="http://schemas.microsoft.com/office/drawing/2016/5/9/chartex" xmlns:cx4="http://schemas.microsoft.com/office/drawing/2016/5/10/chartex" xmlns:cx5="http://schemas.microsoft.com/office/drawing/2016/5/11/chartex" xmlns:cx6="http://schemas.microsoft.com/office/drawing/2016/5/12/chartex" xmlns:cx7="http://schemas.microsoft.com/office/drawing/2016/5/13/chartex" xmlns:cx8="http://schemas.microsoft.com/office/drawing/2016/5/14/chartex" xmlns:mc="http://schemas.openxmlformats.org/markup-compatibility/2006" xmlns:aink="http://schemas.microsoft.com/office/drawing/2016/ink" xmlns:am3d="http://schemas.microsoft.com/office/drawing/2017/model3d" xmlns:o="urn:schemas-microsoft-com:office:office" xmlns:oel="http://schemas.microsoft.com/office/2019/extlst" xmlns:r="http://schemas.openxmlformats.org/officeDocument/2006/relationships" xmlns:m="http://schemas.openxmlformats.org/officeDocument/2006/math" xmlns:v="urn:schemas-microsoft-com:vml" xmlns:wp14="http://schemas.microsoft.com/office/word/2010/wordprocessingDrawing" xmlns:wp="http://schemas.openxmlformats.org/drawingml/2006/wordprocessingDrawing" xmlns:w10="urn:schemas-microsoft-com:office:word" xmlns:w="http://schemas.openxmlformats.org/wordprocessingml/2006/main" xmlns:w14="http://schemas.microsoft.com/office/word/2010/wordml" xmlns:w15="http://schemas.microsoft.com/office/word/2012/wordml" xmlns:w16cex="http://schemas.microsoft.com/office/word/2018/wordml/cex" xmlns:w16cid="http://schemas.microsoft.com/office/word/2016/wordml/cid" xmlns:w16="http://schemas.microsoft.com/office/word/2018/wordml" xmlns:w16du="http://schemas.microsoft.com/office/word/2023/wordml/word16du" xmlns:w16sdtdh="http://schemas.microsoft.com/office/word/2020/wordml/sdtdatahash" xmlns:w16sdtfl="http://schemas.microsoft.com/office/word/2024/wordml/sdtformatlock" xmlns:w16se="http://schemas.microsoft.com/office/word/2015/wordml/symex" xmlns:wpg="http://schemas.microsoft.com/office/word/2010/wordprocessingGroup" xmlns:wpi="http://schemas.microsoft.com/office/word/2010/wordprocessingInk" xmlns:wne="http://schemas.microsoft.com/office/word/2006/wordml" xmlns:wps="http://schemas.microsoft.com/office/word/2010/wordprocessingShape" mc:Ignorable="w14 w15 w16se w16cid w16 w16cex w16sdtdh w16sdtfl w16du wp14">
   <w:footnote w:type="separator" w:id="-1">
     <w:p>
       <w:r>
@@ -6301,7 +6303,7 @@
 </file>
 
 <file path=word/header1.xml><?xml version="1.0" encoding="utf-8"?>
-<w:hdr xmlns:wpc="http://schemas.microsoft.com/office/word/2010/wordprocessingCanvas" xmlns:cx="http://schemas.microsoft.com/office/drawing/2014/chartex" xmlns:cx1="http://schemas.microsoft.com/office/drawing/2015/9/8/chartex" xmlns:cx2="http://schemas.microsoft.com/office/drawing/2015/10/21/chartex" xmlns:cx3="http://schemas.microsoft.com/office/drawing/2016/5/9/chartex" xmlns:cx4="http://schemas.microsoft.com/office/drawing/2016/5/10/chartex" xmlns:cx5="http://schemas.microsoft.com/office/drawing/2016/5/11/chartex" xmlns:cx6="http://schemas.microsoft.com/office/drawing/2016/5/12/chartex" xmlns:cx7="http://schemas.microsoft.com/office/drawing/2016/5/13/chartex" xmlns:cx8="http://schemas.microsoft.com/office/drawing/2016/5/14/chartex" xmlns:mc="http://schemas.openxmlformats.org/markup-compatibility/2006" xmlns:aink="http://schemas.microsoft.com/office/drawing/2016/ink" xmlns:am3d="http://schemas.microsoft.com/office/drawing/2017/model3d" xmlns:o="urn:schemas-microsoft-com:office:office" xmlns:r="http://schemas.openxmlformats.org/officeDocument/2006/relationships" xmlns:m="http://schemas.openxmlformats.org/officeDocument/2006/math" xmlns:v="urn:schemas-microsoft-com:vml" xmlns:wp14="http://schemas.microsoft.com/office/word/2010/wordprocessingDrawing" xmlns:wp="http://schemas.openxmlformats.org/drawingml/2006/wordprocessingDrawing" xmlns:w10="urn:schemas-microsoft-com:office:word" xmlns:w="http://schemas.openxmlformats.org/wordprocessingml/2006/main" xmlns:w14="http://schemas.microsoft.com/office/word/2010/wordml" xmlns:w15="http://schemas.microsoft.com/office/word/2012/wordml" xmlns:w16cex="http://schemas.microsoft.com/office/word/2018/wordml/cex" xmlns:w16cid="http://schemas.microsoft.com/office/word/2016/wordml/cid" xmlns:w16="http://schemas.microsoft.com/office/word/2018/wordml" xmlns:w16sdtdh="http://schemas.microsoft.com/office/word/2020/wordml/sdtdatahash" xmlns:w16se="http://schemas.microsoft.com/office/word/2015/wordml/symex" xmlns:wpg="http://schemas.microsoft.com/office/word/2010/wordprocessingGroup" xmlns:wpi="http://schemas.microsoft.com/office/word/2010/wordprocessingInk" xmlns:wne="http://schemas.microsoft.com/office/word/2006/wordml" xmlns:wps="http://schemas.microsoft.com/office/word/2010/wordprocessingShape" mc:Ignorable="w14 w15 w16se w16cid w16 w16cex w16sdtdh wp14">
+<w:hdr xmlns:wpc="http://schemas.microsoft.com/office/word/2010/wordprocessingCanvas" xmlns:cx="http://schemas.microsoft.com/office/drawing/2014/chartex" xmlns:cx1="http://schemas.microsoft.com/office/drawing/2015/9/8/chartex" xmlns:cx2="http://schemas.microsoft.com/office/drawing/2015/10/21/chartex" xmlns:cx3="http://schemas.microsoft.com/office/drawing/2016/5/9/chartex" xmlns:cx4="http://schemas.microsoft.com/office/drawing/2016/5/10/chartex" xmlns:cx5="http://schemas.microsoft.com/office/drawing/2016/5/11/chartex" xmlns:cx6="http://schemas.microsoft.com/office/drawing/2016/5/12/chartex" xmlns:cx7="http://schemas.microsoft.com/office/drawing/2016/5/13/chartex" xmlns:cx8="http://schemas.microsoft.com/office/drawing/2016/5/14/chartex" xmlns:mc="http://schemas.openxmlformats.org/markup-compatibility/2006" xmlns:aink="http://schemas.microsoft.com/office/drawing/2016/ink" xmlns:am3d="http://schemas.microsoft.com/office/drawing/2017/model3d" xmlns:o="urn:schemas-microsoft-com:office:office" xmlns:oel="http://schemas.microsoft.com/office/2019/extlst" xmlns:r="http://schemas.openxmlformats.org/officeDocument/2006/relationships" xmlns:m="http://schemas.openxmlformats.org/officeDocument/2006/math" xmlns:v="urn:schemas-microsoft-com:vml" xmlns:wp14="http://schemas.microsoft.com/office/word/2010/wordprocessingDrawing" xmlns:wp="http://schemas.openxmlformats.org/drawingml/2006/wordprocessingDrawing" xmlns:w10="urn:schemas-microsoft-com:office:word" xmlns:w="http://schemas.openxmlformats.org/wordprocessingml/2006/main" xmlns:w14="http://schemas.microsoft.com/office/word/2010/wordml" xmlns:w15="http://schemas.microsoft.com/office/word/2012/wordml" xmlns:w16cex="http://schemas.microsoft.com/office/word/2018/wordml/cex" xmlns:w16cid="http://schemas.microsoft.com/office/word/2016/wordml/cid" xmlns:w16="http://schemas.microsoft.com/office/word/2018/wordml" xmlns:w16du="http://schemas.microsoft.com/office/word/2023/wordml/word16du" xmlns:w16sdtdh="http://schemas.microsoft.com/office/word/2020/wordml/sdtdatahash" xmlns:w16sdtfl="http://schemas.microsoft.com/office/word/2024/wordml/sdtformatlock" xmlns:w16se="http://schemas.microsoft.com/office/word/2015/wordml/symex" xmlns:wpg="http://schemas.microsoft.com/office/word/2010/wordprocessingGroup" xmlns:wpi="http://schemas.microsoft.com/office/word/2010/wordprocessingInk" xmlns:wne="http://schemas.microsoft.com/office/word/2006/wordml" xmlns:wps="http://schemas.microsoft.com/office/word/2010/wordprocessingShape" mc:Ignorable="w14 w15 w16se w16cid w16 w16cex w16sdtdh w16sdtfl w16du wp14">
   <w:p>
     <w:pPr>
       <w:pStyle w:val="BodyText"/>
@@ -6599,7 +6601,7 @@
 </file>
 
 <file path=word/numbering.xml><?xml version="1.0" encoding="utf-8"?>
-<w:numbering xmlns:wpc="http://schemas.microsoft.com/office/word/2010/wordprocessingCanvas" xmlns:cx="http://schemas.microsoft.com/office/drawing/2014/chartex" xmlns:cx1="http://schemas.microsoft.com/office/drawing/2015/9/8/chartex" xmlns:cx2="http://schemas.microsoft.com/office/drawing/2015/10/21/chartex" xmlns:cx3="http://schemas.microsoft.com/office/drawing/2016/5/9/chartex" xmlns:cx4="http://schemas.microsoft.com/office/drawing/2016/5/10/chartex" xmlns:cx5="http://schemas.microsoft.com/office/drawing/2016/5/11/chartex" xmlns:cx6="http://schemas.microsoft.com/office/drawing/2016/5/12/chartex" xmlns:cx7="http://schemas.microsoft.com/office/drawing/2016/5/13/chartex" xmlns:cx8="http://schemas.microsoft.com/office/drawing/2016/5/14/chartex" xmlns:mc="http://schemas.openxmlformats.org/markup-compatibility/2006" xmlns:aink="http://schemas.microsoft.com/office/drawing/2016/ink" xmlns:am3d="http://schemas.microsoft.com/office/drawing/2017/model3d" xmlns:o="urn:schemas-microsoft-com:office:office" xmlns:r="http://schemas.openxmlformats.org/officeDocument/2006/relationships" xmlns:m="http://schemas.openxmlformats.org/officeDocument/2006/math" xmlns:v="urn:schemas-microsoft-com:vml" xmlns:wp14="http://schemas.microsoft.com/office/word/2010/wordprocessingDrawing" xmlns:wp="http://schemas.openxmlformats.org/drawingml/2006/wordprocessingDrawing" xmlns:w10="urn:schemas-microsoft-com:office:word" xmlns:w="http://schemas.openxmlformats.org/wordprocessingml/2006/main" xmlns:w14="http://schemas.microsoft.com/office/word/2010/wordml" xmlns:w15="http://schemas.microsoft.com/office/word/2012/wordml" xmlns:w16cex="http://schemas.microsoft.com/office/word/2018/wordml/cex" xmlns:w16cid="http://schemas.microsoft.com/office/word/2016/wordml/cid" xmlns:w16="http://schemas.microsoft.com/office/word/2018/wordml" xmlns:w16sdtdh="http://schemas.microsoft.com/office/word/2020/wordml/sdtdatahash" xmlns:w16se="http://schemas.microsoft.com/office/word/2015/wordml/symex" xmlns:wpg="http://schemas.microsoft.com/office/word/2010/wordprocessingGroup" xmlns:wpi="http://schemas.microsoft.com/office/word/2010/wordprocessingInk" xmlns:wne="http://schemas.microsoft.com/office/word/2006/wordml" xmlns:wps="http://schemas.microsoft.com/office/word/2010/wordprocessingShape" mc:Ignorable="w14 w15 w16se w16cid w16 w16cex w16sdtdh wp14">
+<w:numbering xmlns:wpc="http://schemas.microsoft.com/office/word/2010/wordprocessingCanvas" xmlns:cx="http://schemas.microsoft.com/office/drawing/2014/chartex" xmlns:cx1="http://schemas.microsoft.com/office/drawing/2015/9/8/chartex" xmlns:cx2="http://schemas.microsoft.com/office/drawing/2015/10/21/chartex" xmlns:cx3="http://schemas.microsoft.com/office/drawing/2016/5/9/chartex" xmlns:cx4="http://schemas.microsoft.com/office/drawing/2016/5/10/chartex" xmlns:cx5="http://schemas.microsoft.com/office/drawing/2016/5/11/chartex" xmlns:cx6="http://schemas.microsoft.com/office/drawing/2016/5/12/chartex" xmlns:cx7="http://schemas.microsoft.com/office/drawing/2016/5/13/chartex" xmlns:cx8="http://schemas.microsoft.com/office/drawing/2016/5/14/chartex" xmlns:mc="http://schemas.openxmlformats.org/markup-compatibility/2006" xmlns:aink="http://schemas.microsoft.com/office/drawing/2016/ink" xmlns:am3d="http://schemas.microsoft.com/office/drawing/2017/model3d" xmlns:o="urn:schemas-microsoft-com:office:office" xmlns:oel="http://schemas.microsoft.com/office/2019/extlst" xmlns:r="http://schemas.openxmlformats.org/officeDocument/2006/relationships" xmlns:m="http://schemas.openxmlformats.org/officeDocument/2006/math" xmlns:v="urn:schemas-microsoft-com:vml" xmlns:wp14="http://schemas.microsoft.com/office/word/2010/wordprocessingDrawing" xmlns:wp="http://schemas.openxmlformats.org/drawingml/2006/wordprocessingDrawing" xmlns:w10="urn:schemas-microsoft-com:office:word" xmlns:w="http://schemas.openxmlformats.org/wordprocessingml/2006/main" xmlns:w14="http://schemas.microsoft.com/office/word/2010/wordml" xmlns:w15="http://schemas.microsoft.com/office/word/2012/wordml" xmlns:w16cex="http://schemas.microsoft.com/office/word/2018/wordml/cex" xmlns:w16cid="http://schemas.microsoft.com/office/word/2016/wordml/cid" xmlns:w16="http://schemas.microsoft.com/office/word/2018/wordml" xmlns:w16du="http://schemas.microsoft.com/office/word/2023/wordml/word16du" xmlns:w16sdtdh="http://schemas.microsoft.com/office/word/2020/wordml/sdtdatahash" xmlns:w16sdtfl="http://schemas.microsoft.com/office/word/2024/wordml/sdtformatlock" xmlns:w16se="http://schemas.microsoft.com/office/word/2015/wordml/symex" xmlns:wpg="http://schemas.microsoft.com/office/word/2010/wordprocessingGroup" xmlns:wpi="http://schemas.microsoft.com/office/word/2010/wordprocessingInk" xmlns:wne="http://schemas.microsoft.com/office/word/2006/wordml" xmlns:wps="http://schemas.microsoft.com/office/word/2010/wordprocessingShape" mc:Ignorable="w14 w15 w16se w16cid w16 w16cex w16sdtdh w16sdtfl w16du wp14">
   <w:abstractNum w:abstractNumId="0" w15:restartNumberingAfterBreak="0">
     <w:nsid w:val="1A612D58"/>
     <w:multiLevelType w:val="hybridMultilevel"/>
@@ -7355,32 +7357,32 @@
       </w:pPr>
     </w:lvl>
   </w:abstractNum>
-  <w:num w:numId="1">
+  <w:num w:numId="1" w16cid:durableId="24916211">
     <w:abstractNumId w:val="4"/>
   </w:num>
-  <w:num w:numId="2">
+  <w:num w:numId="2" w16cid:durableId="408619074">
     <w:abstractNumId w:val="3"/>
   </w:num>
-  <w:num w:numId="3">
+  <w:num w:numId="3" w16cid:durableId="1623995921">
     <w:abstractNumId w:val="0"/>
   </w:num>
-  <w:num w:numId="4">
+  <w:num w:numId="4" w16cid:durableId="1930845870">
     <w:abstractNumId w:val="2"/>
   </w:num>
-  <w:num w:numId="5">
+  <w:num w:numId="5" w16cid:durableId="199979092">
     <w:abstractNumId w:val="5"/>
   </w:num>
-  <w:num w:numId="6">
+  <w:num w:numId="6" w16cid:durableId="1404838494">
     <w:abstractNumId w:val="6"/>
   </w:num>
-  <w:num w:numId="7">
+  <w:num w:numId="7" w16cid:durableId="1841197396">
     <w:abstractNumId w:val="1"/>
   </w:num>
 </w:numbering>
 </file>
 
 <file path=word/styles.xml><?xml version="1.0" encoding="utf-8"?>
-<w:styles xmlns:mc="http://schemas.openxmlformats.org/markup-compatibility/2006" xmlns:r="http://schemas.openxmlformats.org/officeDocument/2006/relationships" xmlns:w="http://schemas.openxmlformats.org/wordprocessingml/2006/main" xmlns:w14="http://schemas.microsoft.com/office/word/2010/wordml" xmlns:w15="http://schemas.microsoft.com/office/word/2012/wordml" xmlns:w16cex="http://schemas.microsoft.com/office/word/2018/wordml/cex" xmlns:w16cid="http://schemas.microsoft.com/office/word/2016/wordml/cid" xmlns:w16="http://schemas.microsoft.com/office/word/2018/wordml" xmlns:w16sdtdh="http://schemas.microsoft.com/office/word/2020/wordml/sdtdatahash" xmlns:w16se="http://schemas.microsoft.com/office/word/2015/wordml/symex" mc:Ignorable="w14 w15 w16se w16cid w16 w16cex w16sdtdh">
+<w:styles xmlns:mc="http://schemas.openxmlformats.org/markup-compatibility/2006" xmlns:r="http://schemas.openxmlformats.org/officeDocument/2006/relationships" xmlns:w="http://schemas.openxmlformats.org/wordprocessingml/2006/main" xmlns:w14="http://schemas.microsoft.com/office/word/2010/wordml" xmlns:w15="http://schemas.microsoft.com/office/word/2012/wordml" xmlns:w16cex="http://schemas.microsoft.com/office/word/2018/wordml/cex" xmlns:w16cid="http://schemas.microsoft.com/office/word/2016/wordml/cid" xmlns:w16="http://schemas.microsoft.com/office/word/2018/wordml" xmlns:w16du="http://schemas.microsoft.com/office/word/2023/wordml/word16du" xmlns:w16sdtdh="http://schemas.microsoft.com/office/word/2020/wordml/sdtdatahash" xmlns:w16sdtfl="http://schemas.microsoft.com/office/word/2024/wordml/sdtformatlock" xmlns:w16se="http://schemas.microsoft.com/office/word/2015/wordml/symex" mc:Ignorable="w14 w15 w16se w16cid w16 w16cex w16sdtdh w16sdtfl w16du">
   <w:docDefaults>
     <w:rPrDefault>
       <w:rPr>
@@ -7504,6 +7506,7 @@
     <w:lsdException w:name="HTML Sample" w:semiHidden="1" w:unhideWhenUsed="1"/>
     <w:lsdException w:name="HTML Typewriter" w:semiHidden="1" w:unhideWhenUsed="1"/>
     <w:lsdException w:name="HTML Variable" w:semiHidden="1" w:unhideWhenUsed="1"/>
+    <w:lsdException w:name="Normal Table" w:semiHidden="1" w:unhideWhenUsed="1"/>
     <w:lsdException w:name="annotation subject" w:semiHidden="1" w:unhideWhenUsed="1"/>
     <w:lsdException w:name="No List" w:semiHidden="1" w:unhideWhenUsed="1"/>
     <w:lsdException w:name="Outline List 1" w:semiHidden="1" w:unhideWhenUsed="1"/>
@@ -7546,8 +7549,11 @@
     <w:lsdException w:name="Table Contemporary" w:semiHidden="1" w:unhideWhenUsed="1"/>
     <w:lsdException w:name="Table Elegant" w:semiHidden="1" w:unhideWhenUsed="1"/>
     <w:lsdException w:name="Table Professional" w:semiHidden="1" w:unhideWhenUsed="1"/>
+    <w:lsdException w:name="Table Subtle 1" w:semiHidden="1" w:unhideWhenUsed="1"/>
     <w:lsdException w:name="Table Subtle 2" w:semiHidden="1" w:unhideWhenUsed="1"/>
     <w:lsdException w:name="Table Web 1" w:semiHidden="1" w:unhideWhenUsed="1"/>
+    <w:lsdException w:name="Table Web 2" w:semiHidden="1" w:unhideWhenUsed="1"/>
+    <w:lsdException w:name="Table Web 3" w:semiHidden="1" w:unhideWhenUsed="1"/>
     <w:lsdException w:name="Balloon Text" w:semiHidden="1" w:unhideWhenUsed="1"/>
     <w:lsdException w:name="Table Grid" w:uiPriority="39"/>
     <w:lsdException w:name="Table Theme" w:semiHidden="1" w:unhideWhenUsed="1"/>

</xml_diff>